<commit_message>
content: reconcile employment chronology across site + resume
Correct the timeline to match ground truth: Accelera CAIO May 2026-Present
(delivery/org), add Catapult.io CAIO 2025-2026 (where Glyphon/Colophon were
built + IL5-tested), Equifax Senior Director of Product Management (Jun 2019-
May 2025), Catapult.io CIO 2017-2019, CACI Aug 2016. Removes the cross-source
contradictions flagged by the recruiter review.
</commit_message>
<xml_diff>
--- a/public/assets/resume/Dayel_Ostraco_Resume_CAIO.docx
+++ b/public/assets/resume/Dayel_Ostraco_Resume_CAIO.docx
@@ -2,7 +2,7 @@
 <file path=word/document.xml><?xml version="1.0" encoding="utf-8"?>
 <w:document xmlns:w="http://schemas.openxmlformats.org/wordprocessingml/2006/main" xmlns:m="http://schemas.openxmlformats.org/officeDocument/2006/math" xmlns:r="http://schemas.openxmlformats.org/officeDocument/2006/relationships" xmlns:o="urn:schemas-microsoft-com:office:office" xmlns:v="urn:schemas-microsoft-com:vml" xmlns:w10="urn:schemas-microsoft-com:office:word" xmlns:a="http://schemas.openxmlformats.org/drawingml/2006/main" xmlns:pic="http://schemas.openxmlformats.org/drawingml/2006/picture" xmlns:wp="http://schemas.openxmlformats.org/drawingml/2006/wordprocessingDrawing">
   <w:body>
-    <w:bookmarkStart w:id="21" w:name="dayel-blake-ostraco"/>
+    <w:bookmarkStart w:id="22" w:name="dayel-blake-ostraco"/>
     <w:p>
       <w:pPr>
         <w:pStyle w:val="Heading1"/>
@@ -94,7 +94,7 @@
       </w:r>
     </w:p>
     <w:bookmarkEnd w:id="9"/>
-    <w:bookmarkStart w:id="17" w:name="professional-experience"/>
+    <w:bookmarkStart w:id="18" w:name="professional-experience"/>
     <w:p>
       <w:pPr>
         <w:pStyle w:val="Heading2"/>
@@ -121,7 +121,7 @@
           <w:b/>
           <w:bCs/>
         </w:rPr>
-        <w:t xml:space="preserve">March 2025 – Present</w:t>
+        <w:t xml:space="preserve">May 2026 – Present</w:t>
       </w:r>
     </w:p>
     <w:p>
@@ -133,7 +133,7 @@
         </w:numPr>
       </w:pPr>
       <w:r>
-        <w:t xml:space="preserve">Architected</w:t>
+        <w:t xml:space="preserve">Lead Accelera’s technology organization (97 people, scaling to 140), running</w:t>
       </w:r>
       <w:r>
         <w:t xml:space="preserve"> </w:t>
@@ -146,19 +146,10 @@
         <w:t xml:space="preserve">Glyphon</w:t>
       </w:r>
       <w:r>
-        <w:t xml:space="preserve">, a multi-provider AI agent orchestration platform producing deterministic, reproducible compliance artifacts across OpenAI, Claude, Gemini, and AWS Bedrock; 50 production agents across 7 playbooks (CVE resolution, AMI/container hardening, eMASS POAM, FedRAMP SSP), tested against the IL5 control baseline on AWS GovCloud with Llama 4 Maverick.</w:t>
-      </w:r>
-    </w:p>
-    <w:p>
-      <w:pPr>
-        <w:pStyle w:val="Compact"/>
-        <w:numPr>
-          <w:ilvl w:val="0"/>
-          <w:numId w:val="1001"/>
-        </w:numPr>
-      </w:pPr>
-      <w:r>
-        <w:t xml:space="preserve">Built and operate</w:t>
+        <w:t xml:space="preserve"> </w:t>
+      </w:r>
+      <w:r>
+        <w:t xml:space="preserve">and the</w:t>
       </w:r>
       <w:r>
         <w:t xml:space="preserve"> </w:t>
@@ -171,35 +162,10 @@
         <w:t xml:space="preserve">Colophon</w:t>
       </w:r>
       <w:r>
-        <w:t xml:space="preserve">, a governed AI software factory (specialist agent bench + Claude Code skills) where every merge clears antagonist peer review and Human CCB under cATO discipline; delivered four federal programs with</w:t>
-      </w:r>
-      <w:r>
         <w:t xml:space="preserve"> </w:t>
       </w:r>
       <w:r>
-        <w:rPr>
-          <w:b/>
-          <w:bCs/>
-        </w:rPr>
-        <w:t xml:space="preserve">zero Critical/High/Medium findings</w:t>
-      </w:r>
-      <w:r>
-        <w:t xml:space="preserve"> </w:t>
-      </w:r>
-      <w:r>
-        <w:t xml:space="preserve">(10 Low total).</w:t>
-      </w:r>
-    </w:p>
-    <w:p>
-      <w:pPr>
-        <w:pStyle w:val="Compact"/>
-        <w:numPr>
-          <w:ilvl w:val="0"/>
-          <w:numId w:val="1001"/>
-        </w:numPr>
-      </w:pPr>
-      <w:r>
-        <w:t xml:space="preserve">Deliver the current</w:t>
+        <w:t xml:space="preserve">software factory in production to deliver the current</w:t>
       </w:r>
       <w:r>
         <w:t xml:space="preserve"> </w:t>
@@ -215,7 +181,7 @@
         <w:t xml:space="preserve"> </w:t>
       </w:r>
       <w:r>
-        <w:t xml:space="preserve">federal AI engagement (first established with mSTAX in 2018), leading all AI strategy, delivery, and engineering.</w:t>
+        <w:t xml:space="preserve">federal AI engagement, first established with mSTAX in 2018.</w:t>
       </w:r>
     </w:p>
     <w:p>
@@ -227,7 +193,7 @@
         </w:numPr>
       </w:pPr>
       <w:r>
-        <w:t xml:space="preserve">Deployed AI/ML services within secure DHA enclaves using Llama 4, Llama Vision, Ollama, and Mistral, integrated with PostgreSQL, MongoDB, and CosmosDB for decisioning and inference pipelines.</w:t>
+        <w:t xml:space="preserve">Own all AI strategy, delivery, and engineering across the organization.</w:t>
       </w:r>
     </w:p>
     <w:p>
@@ -239,6 +205,18 @@
         </w:numPr>
       </w:pPr>
       <w:r>
+        <w:t xml:space="preserve">Deploy AI/ML services within secure DHA enclaves using Llama 4, Llama Vision, Ollama, and Mistral, integrated with PostgreSQL, MongoDB, and CosmosDB for decisioning and inference pipelines.</w:t>
+      </w:r>
+    </w:p>
+    <w:p>
+      <w:pPr>
+        <w:pStyle w:val="Compact"/>
+        <w:numPr>
+          <w:ilvl w:val="0"/>
+          <w:numId w:val="1001"/>
+        </w:numPr>
+      </w:pPr>
+      <w:r>
         <w:t xml:space="preserve">Secured multiple ATOs for bleeding-edge platforms (Iroha2 Blockchain, OpenWebUI, NestJS, Ollama) across RMF, STIGs, and Zero Trust; deployed distroless FIPS 140-3 images (Iron Bank/Chainguard) on Zero-CVE baselines.</w:t>
       </w:r>
     </w:p>
@@ -255,13 +233,13 @@
       </w:r>
     </w:p>
     <w:bookmarkEnd w:id="10"/>
-    <w:bookmarkStart w:id="11" w:name="X9a49d3b67824d2dde00e36693b35d8bbd949a1b"/>
+    <w:bookmarkStart w:id="11" w:name="X0017f797ac38d4ea0a3d97d04456119e3954dbe"/>
     <w:p>
       <w:pPr>
         <w:pStyle w:val="Heading3"/>
       </w:pPr>
       <w:r>
-        <w:t xml:space="preserve">Senior Director of Product Development — Equifax, Washington, D.C.</w:t>
+        <w:t xml:space="preserve">Chief AI Officer — Catapult.io, Charleston, SC</w:t>
       </w:r>
     </w:p>
     <w:p>
@@ -273,7 +251,7 @@
           <w:b/>
           <w:bCs/>
         </w:rPr>
-        <w:t xml:space="preserve">June 2019 – March 2025</w:t>
+        <w:t xml:space="preserve">May 2025 – May 2026</w:t>
       </w:r>
     </w:p>
     <w:p>
@@ -285,6 +263,119 @@
         </w:numPr>
       </w:pPr>
       <w:r>
+        <w:t xml:space="preserve">Architected</w:t>
+      </w:r>
+      <w:r>
+        <w:t xml:space="preserve"> </w:t>
+      </w:r>
+      <w:r>
+        <w:rPr>
+          <w:b/>
+          <w:bCs/>
+        </w:rPr>
+        <w:t xml:space="preserve">Glyphon</w:t>
+      </w:r>
+      <w:r>
+        <w:t xml:space="preserve">, a multi-provider AI agent orchestration platform producing deterministic, reproducible compliance artifacts across OpenAI, Claude, Gemini, and AWS Bedrock; 50 production agents across 7 playbooks (CVE resolution, AMI/container hardening, eMASS POAM, FedRAMP SSP); IL5 control baseline tested on AWS GovCloud with Llama 4 Maverick, April 2026.</w:t>
+      </w:r>
+    </w:p>
+    <w:p>
+      <w:pPr>
+        <w:pStyle w:val="Compact"/>
+        <w:numPr>
+          <w:ilvl w:val="0"/>
+          <w:numId w:val="1002"/>
+        </w:numPr>
+      </w:pPr>
+      <w:r>
+        <w:t xml:space="preserve">Built</w:t>
+      </w:r>
+      <w:r>
+        <w:t xml:space="preserve"> </w:t>
+      </w:r>
+      <w:r>
+        <w:rPr>
+          <w:b/>
+          <w:bCs/>
+        </w:rPr>
+        <w:t xml:space="preserve">Colophon</w:t>
+      </w:r>
+      <w:r>
+        <w:t xml:space="preserve">, a governed AI software factory (specialist agent bench + Claude Code skills) that emits the RMF artifact set as a byproduct of delivery, with every merge clearing antagonist peer review and Human CCB under cATO discipline.</w:t>
+      </w:r>
+    </w:p>
+    <w:p>
+      <w:pPr>
+        <w:pStyle w:val="Compact"/>
+        <w:numPr>
+          <w:ilvl w:val="0"/>
+          <w:numId w:val="1002"/>
+        </w:numPr>
+      </w:pPr>
+      <w:r>
+        <w:t xml:space="preserve">Delivered four federal programs with</w:t>
+      </w:r>
+      <w:r>
+        <w:t xml:space="preserve"> </w:t>
+      </w:r>
+      <w:r>
+        <w:rPr>
+          <w:b/>
+          <w:bCs/>
+        </w:rPr>
+        <w:t xml:space="preserve">zero Critical, High, or Medium findings</w:t>
+      </w:r>
+      <w:r>
+        <w:t xml:space="preserve"> </w:t>
+      </w:r>
+      <w:r>
+        <w:t xml:space="preserve">(10 Low total); shipped</w:t>
+      </w:r>
+      <w:r>
+        <w:t xml:space="preserve"> </w:t>
+      </w:r>
+      <w:r>
+        <w:rPr>
+          <w:b/>
+          <w:bCs/>
+        </w:rPr>
+        <w:t xml:space="preserve">Vallark</w:t>
+      </w:r>
+      <w:r>
+        <w:t xml:space="preserve">, an ATO-capable .mil mobile framework compressing 12 months of compliance plumbing to ~4 weeks, with two IL4 systems in production since March 2026 and ATOs held without lapse.</w:t>
+      </w:r>
+    </w:p>
+    <w:bookmarkEnd w:id="11"/>
+    <w:bookmarkStart w:id="12" w:name="X5f622c6192f3b01f648512659f5752779cc5bc0"/>
+    <w:p>
+      <w:pPr>
+        <w:pStyle w:val="Heading3"/>
+      </w:pPr>
+      <w:r>
+        <w:t xml:space="preserve">Senior Director of Product Management — Equifax, Washington, D.C.</w:t>
+      </w:r>
+    </w:p>
+    <w:p>
+      <w:pPr>
+        <w:pStyle w:val="FirstParagraph"/>
+      </w:pPr>
+      <w:r>
+        <w:rPr>
+          <w:b/>
+          <w:bCs/>
+        </w:rPr>
+        <w:t xml:space="preserve">June 2019 – May 2025</w:t>
+      </w:r>
+    </w:p>
+    <w:p>
+      <w:pPr>
+        <w:pStyle w:val="Compact"/>
+        <w:numPr>
+          <w:ilvl w:val="0"/>
+          <w:numId w:val="1003"/>
+        </w:numPr>
+      </w:pPr>
+      <w:r>
         <w:t xml:space="preserve">Directed development of a secure Income and Identity Verification platform for Equifax Government Services, delivering Web and API services to state and federal agencies (CMS, SSA); supported 10M+ daily transactions and $1.7B+ in cumulative program revenue.</w:t>
       </w:r>
     </w:p>
@@ -293,7 +384,7 @@
         <w:pStyle w:val="Compact"/>
         <w:numPr>
           <w:ilvl w:val="0"/>
-          <w:numId w:val="1002"/>
+          <w:numId w:val="1003"/>
         </w:numPr>
       </w:pPr>
       <w:r>
@@ -305,7 +396,7 @@
         <w:pStyle w:val="Compact"/>
         <w:numPr>
           <w:ilvl w:val="0"/>
-          <w:numId w:val="1002"/>
+          <w:numId w:val="1003"/>
         </w:numPr>
       </w:pPr>
       <w:r>
@@ -317,7 +408,7 @@
         <w:pStyle w:val="Compact"/>
         <w:numPr>
           <w:ilvl w:val="0"/>
-          <w:numId w:val="1002"/>
+          <w:numId w:val="1003"/>
         </w:numPr>
       </w:pPr>
       <w:r>
@@ -329,21 +420,21 @@
         <w:pStyle w:val="Compact"/>
         <w:numPr>
           <w:ilvl w:val="0"/>
-          <w:numId w:val="1002"/>
+          <w:numId w:val="1003"/>
         </w:numPr>
       </w:pPr>
       <w:r>
         <w:t xml:space="preserve">Coordinated rapid disaster-relief data solutions (DSNAP) with the State of Florida during Hurricane Ian, enabling real-time identity/income verification under urgent conditions.</w:t>
       </w:r>
     </w:p>
-    <w:bookmarkEnd w:id="11"/>
-    <w:bookmarkStart w:id="12" w:name="X90882291ee5b279a02a8697ad670bd95db05e9d"/>
+    <w:bookmarkEnd w:id="12"/>
+    <w:bookmarkStart w:id="13" w:name="Xfff62b5a5e8cf320042d37b63029314626b2358"/>
     <w:p>
       <w:pPr>
         <w:pStyle w:val="Heading3"/>
       </w:pPr>
       <w:r>
-        <w:t xml:space="preserve">Founder &amp; CTO — Catapult Blockchain, Charleston, SC &amp; Singapore</w:t>
+        <w:t xml:space="preserve">Chief Information Officer — Catapult.io, Charleston, SC &amp; Singapore</w:t>
       </w:r>
     </w:p>
     <w:p>
@@ -363,7 +454,7 @@
         <w:pStyle w:val="Compact"/>
         <w:numPr>
           <w:ilvl w:val="0"/>
-          <w:numId w:val="1003"/>
+          <w:numId w:val="1004"/>
         </w:numPr>
       </w:pPr>
       <w:r>
@@ -388,7 +479,7 @@
         <w:pStyle w:val="Compact"/>
         <w:numPr>
           <w:ilvl w:val="0"/>
-          <w:numId w:val="1003"/>
+          <w:numId w:val="1004"/>
         </w:numPr>
       </w:pPr>
       <w:r>
@@ -406,15 +497,15 @@
         <w:pStyle w:val="Compact"/>
         <w:numPr>
           <w:ilvl w:val="0"/>
-          <w:numId w:val="1003"/>
+          <w:numId w:val="1004"/>
         </w:numPr>
       </w:pPr>
       <w:r>
         <w:t xml:space="preserve">Built the Linxens dLoc platform (blockchain + NFC-linked document twins) for tamper-resistant digital documents; deployed containerized microservices across AWS and Azure for cross-cloud identity assurance.</w:t>
       </w:r>
     </w:p>
-    <w:bookmarkEnd w:id="12"/>
-    <w:bookmarkStart w:id="13" w:name="X91832be423b55600776d4f0e30b376151c8b56c"/>
+    <w:bookmarkEnd w:id="13"/>
+    <w:bookmarkStart w:id="14" w:name="X91832be423b55600776d4f0e30b376151c8b56c"/>
     <w:p>
       <w:pPr>
         <w:pStyle w:val="Heading3"/>
@@ -432,15 +523,15 @@
           <w:b/>
           <w:bCs/>
         </w:rPr>
-        <w:t xml:space="preserve">March 2016 – June 2017</w:t>
-      </w:r>
-    </w:p>
-    <w:p>
-      <w:pPr>
-        <w:pStyle w:val="Compact"/>
-        <w:numPr>
-          <w:ilvl w:val="0"/>
-          <w:numId w:val="1004"/>
+        <w:t xml:space="preserve">August 2016 – June 2017</w:t>
+      </w:r>
+    </w:p>
+    <w:p>
+      <w:pPr>
+        <w:pStyle w:val="Compact"/>
+        <w:numPr>
+          <w:ilvl w:val="0"/>
+          <w:numId w:val="1005"/>
         </w:numPr>
       </w:pPr>
       <w:r>
@@ -452,15 +543,15 @@
         <w:pStyle w:val="Compact"/>
         <w:numPr>
           <w:ilvl w:val="0"/>
-          <w:numId w:val="1004"/>
+          <w:numId w:val="1005"/>
         </w:numPr>
       </w:pPr>
       <w:r>
         <w:t xml:space="preserve">Engineered 50+ secure ingestion pipelines handling terabytes daily in HL7, FHIR, CSV, and OMAP across AWS GovCloud and DoD (.mil) infrastructure, with least-privilege enforcement under RMF and Agile DevSecOps.</w:t>
       </w:r>
     </w:p>
-    <w:bookmarkEnd w:id="13"/>
-    <w:bookmarkStart w:id="14" w:name="Xee46ddbdda7617c09a79714ecf6a51a7517866e"/>
+    <w:bookmarkEnd w:id="14"/>
+    <w:bookmarkStart w:id="15" w:name="Xee46ddbdda7617c09a79714ecf6a51a7517866e"/>
     <w:p>
       <w:pPr>
         <w:pStyle w:val="Heading3"/>
@@ -486,7 +577,7 @@
         <w:pStyle w:val="Compact"/>
         <w:numPr>
           <w:ilvl w:val="0"/>
-          <w:numId w:val="1005"/>
+          <w:numId w:val="1006"/>
         </w:numPr>
       </w:pPr>
       <w:r>
@@ -498,15 +589,15 @@
         <w:pStyle w:val="Compact"/>
         <w:numPr>
           <w:ilvl w:val="0"/>
-          <w:numId w:val="1005"/>
+          <w:numId w:val="1006"/>
         </w:numPr>
       </w:pPr>
       <w:r>
         <w:t xml:space="preserve">Architected a microservices infrastructure of reusable, modular APIs to accelerate time-to-market and optimize cloud cost and margin.</w:t>
       </w:r>
     </w:p>
-    <w:bookmarkEnd w:id="14"/>
-    <w:bookmarkStart w:id="15" w:name="X53cf23d6b092523041436aed7ff614af0acfe10"/>
+    <w:bookmarkEnd w:id="15"/>
+    <w:bookmarkStart w:id="16" w:name="X53cf23d6b092523041436aed7ff614af0acfe10"/>
     <w:p>
       <w:pPr>
         <w:pStyle w:val="Heading3"/>
@@ -532,15 +623,15 @@
         <w:pStyle w:val="Compact"/>
         <w:numPr>
           <w:ilvl w:val="0"/>
-          <w:numId w:val="1006"/>
+          <w:numId w:val="1007"/>
         </w:numPr>
       </w:pPr>
       <w:r>
         <w:t xml:space="preserve">Led architecture of the SPG mobile platform (iOS, Android, Apple Watch) used by millions; the SPG Watch app was featured during Apple’s 2014 keynote. Designed the first mobile check-in/keyless-room system (BLE/NFC + hybrid cloud).</w:t>
       </w:r>
     </w:p>
-    <w:bookmarkEnd w:id="15"/>
-    <w:bookmarkStart w:id="16" w:name="Xa46df9879d39d93679a445537e523582fe0daee"/>
+    <w:bookmarkEnd w:id="16"/>
+    <w:bookmarkStart w:id="17" w:name="Xa46df9879d39d93679a445537e523582fe0daee"/>
     <w:p>
       <w:pPr>
         <w:pStyle w:val="Heading3"/>
@@ -566,7 +657,7 @@
         <w:pStyle w:val="Compact"/>
         <w:numPr>
           <w:ilvl w:val="0"/>
-          <w:numId w:val="1007"/>
+          <w:numId w:val="1008"/>
         </w:numPr>
       </w:pPr>
       <w:r>
@@ -580,9 +671,9 @@
         </w:pict>
       </w:r>
     </w:p>
-    <w:bookmarkEnd w:id="16"/>
     <w:bookmarkEnd w:id="17"/>
-    <w:bookmarkStart w:id="18" w:name="technical-proficiencies"/>
+    <w:bookmarkEnd w:id="18"/>
+    <w:bookmarkStart w:id="19" w:name="technical-proficiencies"/>
     <w:p>
       <w:pPr>
         <w:pStyle w:val="Heading2"/>
@@ -670,8 +761,8 @@
         </w:pict>
       </w:r>
     </w:p>
-    <w:bookmarkEnd w:id="18"/>
-    <w:bookmarkStart w:id="19" w:name="certifications-clearance"/>
+    <w:bookmarkEnd w:id="19"/>
+    <w:bookmarkStart w:id="20" w:name="certifications-clearance"/>
     <w:p>
       <w:pPr>
         <w:pStyle w:val="Heading2"/>
@@ -685,7 +776,7 @@
         <w:pStyle w:val="Compact"/>
         <w:numPr>
           <w:ilvl w:val="0"/>
-          <w:numId w:val="1008"/>
+          <w:numId w:val="1009"/>
         </w:numPr>
       </w:pPr>
       <w:r>
@@ -697,15 +788,15 @@
         <w:pStyle w:val="Compact"/>
         <w:numPr>
           <w:ilvl w:val="0"/>
-          <w:numId w:val="1008"/>
+          <w:numId w:val="1009"/>
         </w:numPr>
       </w:pPr>
       <w:r>
         <w:t xml:space="preserve">Active DoD Secret Security Clearance, TS-eligible — U.S. Department of Defense</w:t>
       </w:r>
     </w:p>
-    <w:bookmarkEnd w:id="19"/>
-    <w:bookmarkStart w:id="20" w:name="education"/>
+    <w:bookmarkEnd w:id="20"/>
+    <w:bookmarkStart w:id="21" w:name="education"/>
     <w:p>
       <w:pPr>
         <w:pStyle w:val="Heading2"/>
@@ -731,7 +822,7 @@
         <w:pStyle w:val="Compact"/>
         <w:numPr>
           <w:ilvl w:val="0"/>
-          <w:numId w:val="1009"/>
+          <w:numId w:val="1010"/>
         </w:numPr>
       </w:pPr>
       <w:r>
@@ -743,15 +834,15 @@
         <w:pStyle w:val="Compact"/>
         <w:numPr>
           <w:ilvl w:val="0"/>
-          <w:numId w:val="1009"/>
+          <w:numId w:val="1010"/>
         </w:numPr>
       </w:pPr>
       <w:r>
         <w:t xml:space="preserve">B.A. Computer Science</w:t>
       </w:r>
     </w:p>
-    <w:bookmarkEnd w:id="20"/>
     <w:bookmarkEnd w:id="21"/>
+    <w:bookmarkEnd w:id="22"/>
     <w:sectPr>
       <w:footnotePr>
         <w:numRestart w:val="eachSect"/>
@@ -993,6 +1084,9 @@
     <w:abstractNumId w:val="991"/>
   </w:num>
   <w:num w:numId="1009">
+    <w:abstractNumId w:val="991"/>
+  </w:num>
+  <w:num w:numId="1010">
     <w:abstractNumId w:val="991"/>
   </w:num>
 </w:numbering>

</xml_diff>

<commit_message>
content: mirror CUI-provenance note on resume footer
</commit_message>
<xml_diff>
--- a/public/assets/resume/Dayel_Ostraco_Resume_CAIO.docx
+++ b/public/assets/resume/Dayel_Ostraco_Resume_CAIO.docx
@@ -839,6 +839,25 @@
       </w:pPr>
       <w:r>
         <w:t xml:space="preserve">B.A. Computer Science</w:t>
+      </w:r>
+    </w:p>
+    <w:p>
+      <w:r>
+        <w:pict>
+          <v:rect style="width:0;height:1.5pt" o:hralign="center" o:hrstd="t" o:hr="t"/>
+        </w:pict>
+      </w:r>
+    </w:p>
+    <w:p>
+      <w:pPr>
+        <w:pStyle w:val="FirstParagraph"/>
+      </w:pPr>
+      <w:r>
+        <w:rPr>
+          <w:i/>
+          <w:iCs/>
+        </w:rPr>
+        <w:t xml:space="preserve">Metrics reflect accredited federal engagements. Program names, accreditation dates, and evidence packages are CUI or classified, and available only to appropriately cleared parties through official channels.</w:t>
       </w:r>
     </w:p>
     <w:bookmarkEnd w:id="21"/>

</xml_diff>

<commit_message>
content: Catapult 2017-2019 -> Founder & CIO (makes 'two-time founder' consistent)
Restore founder visibility on the Catapult.io 2017-2019 role so the
'two-time founder' claim has two visible foundings (Qonceptual + Catapult),
resolving the consistency nit Fable flagged. Keeps the CIO title.
</commit_message>
<xml_diff>
--- a/public/assets/resume/Dayel_Ostraco_Resume_CAIO.docx
+++ b/public/assets/resume/Dayel_Ostraco_Resume_CAIO.docx
@@ -428,13 +428,13 @@
       </w:r>
     </w:p>
     <w:bookmarkEnd w:id="12"/>
-    <w:bookmarkStart w:id="13" w:name="Xfff62b5a5e8cf320042d37b63029314626b2358"/>
+    <w:bookmarkStart w:id="13" w:name="X931b84f91a8947d307da419083948e18a0c7d73"/>
     <w:p>
       <w:pPr>
         <w:pStyle w:val="Heading3"/>
       </w:pPr>
       <w:r>
-        <w:t xml:space="preserve">Chief Information Officer — Catapult.io, Charleston, SC &amp; Singapore</w:t>
+        <w:t xml:space="preserve">Founder &amp; CIO — Catapult.io, Charleston, SC &amp; Singapore</w:t>
       </w:r>
     </w:p>
     <w:p>

</xml_diff>

<commit_message>
content: distinguish the two Catapult.io entities, drop acquirer name, add DHA EMPIRE
- Catapult.io (US, DBA SigilArk) 2025-2026 vs Catapult.io (Singapore) 2017-2019,
  so the two entries don't read as a contradiction (sold in 2019, back in 2025).
- Drop the Linxens name: 'Sold to Linxens' -> 'Acquired'; 'Linxens dLoc' -> 'dLoc'.
- Add: led development of DHA's agency-wide EMPIRE software factory (2025-2026).
- Regenerated resume PDF/DOCX to match.
</commit_message>
<xml_diff>
--- a/public/assets/resume/Dayel_Ostraco_Resume_CAIO.docx
+++ b/public/assets/resume/Dayel_Ostraco_Resume_CAIO.docx
@@ -233,13 +233,13 @@
       </w:r>
     </w:p>
     <w:bookmarkEnd w:id="10"/>
-    <w:bookmarkStart w:id="11" w:name="X0017f797ac38d4ea0a3d97d04456119e3954dbe"/>
+    <w:bookmarkStart w:id="11" w:name="Xdda4af425459acb28f84e38d03fb36d36c710f7"/>
     <w:p>
       <w:pPr>
         <w:pStyle w:val="Heading3"/>
       </w:pPr>
       <w:r>
-        <w:t xml:space="preserve">Chief AI Officer — Catapult.io, Charleston, SC</w:t>
+        <w:t xml:space="preserve">Chief AI Officer — Catapult.io (US, DBA SigilArk), Charleston, SC</w:t>
       </w:r>
     </w:p>
     <w:p>
@@ -263,7 +263,7 @@
         </w:numPr>
       </w:pPr>
       <w:r>
-        <w:t xml:space="preserve">Architected</w:t>
+        <w:t xml:space="preserve">Led the development work for</w:t>
       </w:r>
       <w:r>
         <w:t xml:space="preserve"> </w:t>
@@ -273,10 +273,10 @@
           <w:b/>
           <w:bCs/>
         </w:rPr>
-        <w:t xml:space="preserve">Glyphon</w:t>
-      </w:r>
-      <w:r>
-        <w:t xml:space="preserve">, a multi-provider AI agent orchestration platform producing deterministic, reproducible compliance artifacts across OpenAI, Claude, Gemini, and AWS Bedrock; 50 production agents across 7 playbooks (CVE resolution, AMI/container hardening, eMASS POAM, FedRAMP SSP); IL5 control baseline tested on AWS GovCloud with Llama 4 Maverick, April 2026.</w:t>
+        <w:t xml:space="preserve">DHA’s agency-wide EMPIRE software factory</w:t>
+      </w:r>
+      <w:r>
+        <w:t xml:space="preserve">, delivering the governed AI delivery capability now in production across the agency.</w:t>
       </w:r>
     </w:p>
     <w:p>
@@ -288,7 +288,7 @@
         </w:numPr>
       </w:pPr>
       <w:r>
-        <w:t xml:space="preserve">Built</w:t>
+        <w:t xml:space="preserve">Architected</w:t>
       </w:r>
       <w:r>
         <w:t xml:space="preserve"> </w:t>
@@ -298,10 +298,10 @@
           <w:b/>
           <w:bCs/>
         </w:rPr>
-        <w:t xml:space="preserve">Colophon</w:t>
-      </w:r>
-      <w:r>
-        <w:t xml:space="preserve">, a governed AI software factory (specialist agent bench + Claude Code skills) that emits the RMF artifact set as a byproduct of delivery, with every merge clearing antagonist peer review and Human CCB under cATO discipline.</w:t>
+        <w:t xml:space="preserve">Glyphon</w:t>
+      </w:r>
+      <w:r>
+        <w:t xml:space="preserve">, a multi-provider AI agent orchestration platform producing deterministic, reproducible compliance artifacts across OpenAI, Claude, Gemini, and AWS Bedrock; 50 production agents across 7 playbooks (CVE resolution, AMI/container hardening, eMASS POAM, FedRAMP SSP); IL5 control baseline tested on AWS GovCloud with Llama 4 Maverick, April 2026.</w:t>
       </w:r>
     </w:p>
     <w:p>
@@ -313,7 +313,7 @@
         </w:numPr>
       </w:pPr>
       <w:r>
-        <w:t xml:space="preserve">Delivered four federal programs with</w:t>
+        <w:t xml:space="preserve">Built</w:t>
       </w:r>
       <w:r>
         <w:t xml:space="preserve"> </w:t>
@@ -323,13 +323,22 @@
           <w:b/>
           <w:bCs/>
         </w:rPr>
-        <w:t xml:space="preserve">zero Critical, High, or Medium findings</w:t>
-      </w:r>
-      <w:r>
-        <w:t xml:space="preserve"> </w:t>
-      </w:r>
-      <w:r>
-        <w:t xml:space="preserve">(10 Low total); shipped</w:t>
+        <w:t xml:space="preserve">Colophon</w:t>
+      </w:r>
+      <w:r>
+        <w:t xml:space="preserve">, a governed AI software factory (specialist agent bench + Claude Code skills) that emits the RMF artifact set as a byproduct of delivery, with every merge clearing antagonist peer review and Human CCB under cATO discipline.</w:t>
+      </w:r>
+    </w:p>
+    <w:p>
+      <w:pPr>
+        <w:pStyle w:val="Compact"/>
+        <w:numPr>
+          <w:ilvl w:val="0"/>
+          <w:numId w:val="1002"/>
+        </w:numPr>
+      </w:pPr>
+      <w:r>
+        <w:t xml:space="preserve">Delivered four federal programs with</w:t>
       </w:r>
       <w:r>
         <w:t xml:space="preserve"> </w:t>
@@ -339,6 +348,22 @@
           <w:b/>
           <w:bCs/>
         </w:rPr>
+        <w:t xml:space="preserve">zero Critical, High, or Medium findings</w:t>
+      </w:r>
+      <w:r>
+        <w:t xml:space="preserve"> </w:t>
+      </w:r>
+      <w:r>
+        <w:t xml:space="preserve">(10 Low total); shipped</w:t>
+      </w:r>
+      <w:r>
+        <w:t xml:space="preserve"> </w:t>
+      </w:r>
+      <w:r>
+        <w:rPr>
+          <w:b/>
+          <w:bCs/>
+        </w:rPr>
         <w:t xml:space="preserve">Vallark</w:t>
       </w:r>
       <w:r>
@@ -428,13 +453,13 @@
       </w:r>
     </w:p>
     <w:bookmarkEnd w:id="12"/>
-    <w:bookmarkStart w:id="13" w:name="X931b84f91a8947d307da419083948e18a0c7d73"/>
+    <w:bookmarkStart w:id="13" w:name="X3337d788d831db50ecb08c21f4c57a217177c33"/>
     <w:p>
       <w:pPr>
         <w:pStyle w:val="Heading3"/>
       </w:pPr>
       <w:r>
-        <w:t xml:space="preserve">Founder &amp; CIO — Catapult.io, Charleston, SC &amp; Singapore</w:t>
+        <w:t xml:space="preserve">Founder &amp; CIO — Catapult.io (Singapore), Charleston, SC &amp; Singapore</w:t>
       </w:r>
     </w:p>
     <w:p>
@@ -446,7 +471,7 @@
           <w:b/>
           <w:bCs/>
         </w:rPr>
-        <w:t xml:space="preserve">July 2017 – Sold to Linxens, June 2019</w:t>
+        <w:t xml:space="preserve">July 2017 – Acquired, June 2019</w:t>
       </w:r>
     </w:p>
     <w:p>
@@ -501,7 +526,7 @@
         </w:numPr>
       </w:pPr>
       <w:r>
-        <w:t xml:space="preserve">Built the Linxens dLoc platform (blockchain + NFC-linked document twins) for tamper-resistant digital documents; deployed containerized microservices across AWS and Azure for cross-cloud identity assurance.</w:t>
+        <w:t xml:space="preserve">Built the dLoc platform (blockchain + NFC-linked document twins) for tamper-resistant digital documents; deployed containerized microservices across AWS and Azure for cross-cloud identity assurance.</w:t>
       </w:r>
     </w:p>
     <w:bookmarkEnd w:id="13"/>

</xml_diff>

<commit_message>
content: label the 2025-2026 entity as SigilArk (its DBA); restore Linxens dLoc product name
- 2025-2026 role now displays as SigilArk (Catapult.io US), matching the brand
  the products + forthcoming LinkedIn company page operate under; cleaner
  disambiguation from Catapult.io (Singapore) than the (US) tag.
- Restore 'Linxens dLoc' as the product name (only the acquirer attribution
  was meant to be dropped). Regenerated resume PDF/DOCX.
</commit_message>
<xml_diff>
--- a/public/assets/resume/Dayel_Ostraco_Resume_CAIO.docx
+++ b/public/assets/resume/Dayel_Ostraco_Resume_CAIO.docx
@@ -233,13 +233,13 @@
       </w:r>
     </w:p>
     <w:bookmarkEnd w:id="10"/>
-    <w:bookmarkStart w:id="11" w:name="Xdda4af425459acb28f84e38d03fb36d36c710f7"/>
+    <w:bookmarkStart w:id="11" w:name="Xc2469e39dbf6f1d414ed66bf366a0a2edb09f67"/>
     <w:p>
       <w:pPr>
         <w:pStyle w:val="Heading3"/>
       </w:pPr>
       <w:r>
-        <w:t xml:space="preserve">Chief AI Officer — Catapult.io (US, DBA SigilArk), Charleston, SC</w:t>
+        <w:t xml:space="preserve">Chief AI Officer — SigilArk (Catapult.io US), Charleston, SC</w:t>
       </w:r>
     </w:p>
     <w:p>
@@ -526,7 +526,7 @@
         </w:numPr>
       </w:pPr>
       <w:r>
-        <w:t xml:space="preserve">Built the dLoc platform (blockchain + NFC-linked document twins) for tamper-resistant digital documents; deployed containerized microservices across AWS and Azure for cross-cloud identity assurance.</w:t>
+        <w:t xml:space="preserve">Built the Linxens dLoc platform (blockchain + NFC-linked document twins) for tamper-resistant digital documents; deployed containerized microservices across AWS and Azure for cross-cloud identity assurance.</w:t>
       </w:r>
     </w:p>
     <w:bookmarkEnd w:id="13"/>

</xml_diff>

<commit_message>
content: use SigilArk alone for the 2025-2026 role (drop the Catapult.io US tag)
The DBA is what it operates under and matches the LinkedIn company page; the
Catapult.io (Singapore) entry keeps its label. Regenerated resume PDF/DOCX.
</commit_message>
<xml_diff>
--- a/public/assets/resume/Dayel_Ostraco_Resume_CAIO.docx
+++ b/public/assets/resume/Dayel_Ostraco_Resume_CAIO.docx
@@ -233,13 +233,13 @@
       </w:r>
     </w:p>
     <w:bookmarkEnd w:id="10"/>
-    <w:bookmarkStart w:id="11" w:name="Xc2469e39dbf6f1d414ed66bf366a0a2edb09f67"/>
+    <w:bookmarkStart w:id="11" w:name="chief-ai-officer-sigilark-charleston-sc"/>
     <w:p>
       <w:pPr>
         <w:pStyle w:val="Heading3"/>
       </w:pPr>
       <w:r>
-        <w:t xml:space="preserve">Chief AI Officer — SigilArk (Catapult.io US), Charleston, SC</w:t>
+        <w:t xml:space="preserve">Chief AI Officer — SigilArk, Charleston, SC</w:t>
       </w:r>
     </w:p>
     <w:p>

</xml_diff>

<commit_message>
content: reconcile role titles and Qonceptual dates across site, resume, LinkedIn
A recruiter-panel run over all three public sources (LinkedIn, dayelostra.co,
resume) scored cross-source consistency 4/10, citing four title/date mismatches
where LinkedIn disagreed with the site and resume.

Resolved in favor of the titles of record:

- Booz Allen: Director -> Senior Director of Software Engineering (site + resume
  raised to match LinkedIn)
- Qonceptual: dates 2014-2016 -> 2013-2016, with the resume noting founded April
  2013 and full-time from June 2014, which reconciles the two prior date ranges
  and explains the Starwood overlap

Regenerated the resume PDF/DOCX from the markdown source via pandoc + tectonic.

The remaining three edits (Qonceptual title and end date, Starwood title,
Catapult.io title, plus a 99.5% -> 99.6% STIG correction) are LinkedIn-side and
applied separately.
</commit_message>
<xml_diff>
--- a/public/assets/resume/Dayel_Ostraco_Resume_CAIO.docx
+++ b/public/assets/resume/Dayel_Ostraco_Resume_CAIO.docx
@@ -594,7 +594,13 @@
           <w:b/>
           <w:bCs/>
         </w:rPr>
-        <w:t xml:space="preserve">June 2014 – Sold, December 2016</w:t>
+        <w:t xml:space="preserve">April 2013 – Sold, December 2016</w:t>
+      </w:r>
+      <w:r>
+        <w:t xml:space="preserve"> </w:t>
+      </w:r>
+      <w:r>
+        <w:t xml:space="preserve">(founded April 2013; full-time from June 2014)</w:t>
       </w:r>
     </w:p>
     <w:p>
@@ -656,13 +662,13 @@
       </w:r>
     </w:p>
     <w:bookmarkEnd w:id="16"/>
-    <w:bookmarkStart w:id="17" w:name="Xa46df9879d39d93679a445537e523582fe0daee"/>
+    <w:bookmarkStart w:id="17" w:name="X0bc7b23fad1d04a07c4295e934e3e43faca201e"/>
     <w:p>
       <w:pPr>
         <w:pStyle w:val="Heading3"/>
       </w:pPr>
       <w:r>
-        <w:t xml:space="preserve">Director of Software Engineering — Booz Allen Hamilton, Charleston, SC</w:t>
+        <w:t xml:space="preserve">Senior Director of Software Engineering — Booz Allen Hamilton, Charleston, SC</w:t>
       </w:r>
     </w:p>
     <w:p>

</xml_diff>

<commit_message>
content: give the DHA Cyber Command adoption and PI Award one clear owner
The same achievement was attached to three different owners across the public
sources: LinkedIn read as Accelera, the site listed EMPIRE under SigilArk, and
the PI Award sat on the Accelera card. A recruiter panel flagged the attribution
chain as unresolvable from the corpus.

Attributes the adoption and award to the period where the work happened
(SigilArk, 2025-2026) and has the current role inherit it explicitly:

- site, SigilArk card: adds the adoption + PI Award alongside EMPIRE
- site, Accelera card: "Runs the delivery methodology DHA Cyber Command adopted
  in 2025-2026" rather than claiming the adoption under a four-month tenure
- resume summary: dates the adoption to 2025-2026
- resume, SigilArk entry: states the adoption and award where the work is described

Regenerated the resume PDF/DOCX.
</commit_message>
<xml_diff>
--- a/public/assets/resume/Dayel_Ostraco_Resume_CAIO.docx
+++ b/public/assets/resume/Dayel_Ostraco_Resume_CAIO.docx
@@ -83,7 +83,7 @@
         <w:t xml:space="preserve">zero Critical, High, or Medium findings across four federal programs</w:t>
       </w:r>
       <w:r>
-        <w:t xml:space="preserve">, 83.5% CVE auto-resolution (101 of 121), 99.6% (246 of 247) of the Windows Server 2022 STIG passing, AMI-hardened and STIG Viewer-verified, and platforms tested against the IL5 control baseline on AWS GovCloud. Five production DHA healthcare workloads were hardened to near-zero CVE on RHEL UBI 9 Minimal at a 93.2% STIG-checklist auto-pass rate (verified in STIG Viewer via Semgrep, Gitleaks, Trivy, and StackRox); the remaining checks were handled manually to protect OS and application stability. The delivery methodology was adopted program-wide by DHA Cyber Command and earned a PI Award. Trusted by the DoD, DHA, SSA, and CMS, and by global financial institutions, to architect systems that move billions in transactions, scale to millions of daily users, and survive the audit afterward. CISSP; active DoD Secret clearance, TS-eligible.</w:t>
+        <w:t xml:space="preserve">, 83.5% CVE auto-resolution (101 of 121), 99.6% (246 of 247) of the Windows Server 2022 STIG passing, AMI-hardened and STIG Viewer-verified, and platforms tested against the IL5 control baseline on AWS GovCloud. Five production DHA healthcare workloads were hardened to near-zero CVE on RHEL UBI 9 Minimal at a 93.2% STIG-checklist auto-pass rate (verified in STIG Viewer via Semgrep, Gitleaks, Trivy, and StackRox); the remaining checks were handled manually to protect OS and application stability. The delivery methodology was adopted program-wide by DHA Cyber Command in 2025-2026 and earned a PI Award. Trusted by the DoD, DHA, SSA, and CMS, and by global financial institutions, to architect systems that move billions in transactions, scale to millions of daily users, and survive the audit afterward. CISSP; active DoD Secret clearance, TS-eligible.</w:t>
       </w:r>
     </w:p>
     <w:p>
@@ -276,7 +276,7 @@
         <w:t xml:space="preserve">DHA’s agency-wide EMPIRE software factory</w:t>
       </w:r>
       <w:r>
-        <w:t xml:space="preserve">, delivering the governed AI delivery capability now in production across the agency.</w:t>
+        <w:t xml:space="preserve">, delivering the governed AI delivery capability now in production across the agency. The delivery methodology was adopted program-wide by DHA Cyber Command and earned a PI Award.</w:t>
       </w:r>
     </w:p>
     <w:p>

</xml_diff>

<commit_message>
content: reconcile role titles and Qonceptual dates across site, resume, LinkedIn (#43)
A recruiter-panel run over all three public sources (LinkedIn, dayelostra.co,
resume) scored cross-source consistency 4/10, citing four title/date mismatches
where LinkedIn disagreed with the site and resume.

Resolved in favor of the titles of record:

- Booz Allen: Director -> Senior Director of Software Engineering (site + resume
  raised to match LinkedIn)
- Qonceptual: dates 2014-2016 -> 2013-2016, with the resume noting founded April
  2013 and full-time from June 2014, which reconciles the two prior date ranges
  and explains the Starwood overlap

Regenerated the resume PDF/DOCX from the markdown source via pandoc + tectonic.

The remaining three edits (Qonceptual title and end date, Starwood title,
Catapult.io title, plus a 99.5% -> 99.6% STIG correction) are LinkedIn-side and
applied separately.

Co-authored-by: dayelostraco <dayel.ostraco@gmail.com>
</commit_message>
<xml_diff>
--- a/public/assets/resume/Dayel_Ostraco_Resume_CAIO.docx
+++ b/public/assets/resume/Dayel_Ostraco_Resume_CAIO.docx
@@ -594,7 +594,13 @@
           <w:b/>
           <w:bCs/>
         </w:rPr>
-        <w:t xml:space="preserve">June 2014 – Sold, December 2016</w:t>
+        <w:t xml:space="preserve">April 2013 – Sold, December 2016</w:t>
+      </w:r>
+      <w:r>
+        <w:t xml:space="preserve"> </w:t>
+      </w:r>
+      <w:r>
+        <w:t xml:space="preserve">(founded April 2013; full-time from June 2014)</w:t>
       </w:r>
     </w:p>
     <w:p>
@@ -656,13 +662,13 @@
       </w:r>
     </w:p>
     <w:bookmarkEnd w:id="16"/>
-    <w:bookmarkStart w:id="17" w:name="Xa46df9879d39d93679a445537e523582fe0daee"/>
+    <w:bookmarkStart w:id="17" w:name="X0bc7b23fad1d04a07c4295e934e3e43faca201e"/>
     <w:p>
       <w:pPr>
         <w:pStyle w:val="Heading3"/>
       </w:pPr>
       <w:r>
-        <w:t xml:space="preserve">Director of Software Engineering — Booz Allen Hamilton, Charleston, SC</w:t>
+        <w:t xml:space="preserve">Senior Director of Software Engineering — Booz Allen Hamilton, Charleston, SC</w:t>
       </w:r>
     </w:p>
     <w:p>

</xml_diff>